<commit_message>
databehandling tilføjet til bromelin-i-ananas.qmd
</commit_message>
<xml_diff>
--- a/Øvelser/Biologi/bromelin-i-ananas/bromelin-i-ananas.docx
+++ b/Øvelser/Biologi/bromelin-i-ananas/bromelin-i-ananas.docx
@@ -992,6 +992,593 @@
       </w:tr>
     </w:tbl>
     <w:bookmarkEnd w:id="31"/>
+    <w:bookmarkStart w:id="33" w:name="databehandling"/>
+    <w:p>
+      <w:pPr>
+        <w:pStyle w:val="Heading2"/>
+      </w:pPr>
+      <w:r>
+        <w:t xml:space="preserve">Databehandling</w:t>
+      </w:r>
+    </w:p>
+    <w:p>
+      <w:pPr>
+        <w:pStyle w:val="Compact"/>
+        <w:numPr>
+          <w:ilvl w:val="0"/>
+          <w:numId w:val="1004"/>
+        </w:numPr>
+      </w:pPr>
+      <w:r>
+        <w:t xml:space="preserve">Gør resultaterne op i</w:t>
+      </w:r>
+      <w:r>
+        <w:t xml:space="preserve"> </w:t>
+      </w:r>
+      <w:hyperlink w:anchor="tbl-1">
+        <w:r>
+          <w:rPr>
+            <w:rStyle w:val="Hyperlink"/>
+          </w:rPr>
+          <w:t xml:space="preserve">Tabel 1</w:t>
+        </w:r>
+      </w:hyperlink>
+      <w:r>
+        <w:t xml:space="preserve">. Skriv for hvert glas, om gelatinen stivnede helt, delvist eller slet ikke —</w:t>
+      </w:r>
+      <w:r>
+        <w:t xml:space="preserve"> </w:t>
+      </w:r>
+      <w:r>
+        <w:t xml:space="preserve">“delvist”</w:t>
+      </w:r>
+      <w:r>
+        <w:t xml:space="preserve"> </w:t>
+      </w:r>
+      <w:r>
+        <w:t xml:space="preserve">er et gyldigt resultat, og så skal I beskrive, hvor tyktflydende indholdet var, når I vippede glasset. Dokumentér beskrivelsen med jeres fotos, og husk figurnummer og figurtekst.</w:t>
+      </w:r>
+    </w:p>
+    <w:p>
+      <w:pPr>
+        <w:pStyle w:val="Compact"/>
+        <w:numPr>
+          <w:ilvl w:val="0"/>
+          <w:numId w:val="1004"/>
+        </w:numPr>
+      </w:pPr>
+      <w:r>
+        <w:t xml:space="preserve">Forklar forskellen mellem glas 1 og kontrolglasset (glas 4) ud fra enzym og substrat: bromelin er et enzym, der spalter proteiner, og gelatine er et protein. Hvad sker der med gelatinens lange proteinkæder, og hvorfor kan de så ikke længere danne det netværk, der får blandingen til at stivne? Forklar samtidig, hvad I</w:t>
+      </w:r>
+      <w:r>
+        <w:t xml:space="preserve"> </w:t>
+      </w:r>
+      <w:r>
+        <w:rPr>
+          <w:i/>
+          <w:iCs/>
+        </w:rPr>
+        <w:t xml:space="preserve">ikke</w:t>
+      </w:r>
+      <w:r>
+        <w:t xml:space="preserve"> </w:t>
+      </w:r>
+      <w:r>
+        <w:t xml:space="preserve">kunne have konkluderet uden kontrolglasset.</w:t>
+      </w:r>
+    </w:p>
+    <w:p>
+      <w:pPr>
+        <w:pStyle w:val="Compact"/>
+        <w:numPr>
+          <w:ilvl w:val="0"/>
+          <w:numId w:val="1004"/>
+        </w:numPr>
+      </w:pPr>
+      <w:r>
+        <w:t xml:space="preserve">I sørgede for lige meget væske i alle fire glas. Hvilken alternativ forklaring på et flydende glas 1 udelukker det?</w:t>
+      </w:r>
+    </w:p>
+    <w:p>
+      <w:pPr>
+        <w:pStyle w:val="Compact"/>
+        <w:numPr>
+          <w:ilvl w:val="0"/>
+          <w:numId w:val="1004"/>
+        </w:numPr>
+      </w:pPr>
+      <w:r>
+        <w:t xml:space="preserve">Sammenlign glas 1 og glas 2. Forklar med ordene</w:t>
+      </w:r>
+      <w:r>
+        <w:t xml:space="preserve"> </w:t>
+      </w:r>
+      <w:r>
+        <w:rPr>
+          <w:i/>
+          <w:iCs/>
+        </w:rPr>
+        <w:t xml:space="preserve">denaturering</w:t>
+      </w:r>
+      <w:r>
+        <w:t xml:space="preserve"> </w:t>
+      </w:r>
+      <w:r>
+        <w:t xml:space="preserve">og</w:t>
+      </w:r>
+      <w:r>
+        <w:t xml:space="preserve"> </w:t>
+      </w:r>
+      <w:r>
+        <w:rPr>
+          <w:i/>
+          <w:iCs/>
+        </w:rPr>
+        <w:t xml:space="preserve">aktivt center</w:t>
+      </w:r>
+      <w:r>
+        <w:t xml:space="preserve">, hvad kogningen gjorde ved enzymet. Bemærk, at den kogte saft stadig indeholder ananassaftens sukker og syre — hvilken forklaring på resultatet i glas 1 kan I dermed afvise?</w:t>
+      </w:r>
+    </w:p>
+    <w:p>
+      <w:pPr>
+        <w:pStyle w:val="Compact"/>
+        <w:numPr>
+          <w:ilvl w:val="0"/>
+          <w:numId w:val="1004"/>
+        </w:numPr>
+      </w:pPr>
+      <w:r>
+        <w:t xml:space="preserve">Sammenlign glas 1 og glas 3. Enzymer virker kun i et bestemt pH-interval; forklar ud fra jeres resultat, hvad saltsyren gjorde ved bromelinen. Hvis man ville bruge det samme trick i køkkenet for at få frisk ananas til at stivne i en dessert, hvilke utilsigtede virkninger skulle man så regne med?</w:t>
+      </w:r>
+    </w:p>
+    <w:p>
+      <w:pPr>
+        <w:pStyle w:val="Compact"/>
+        <w:numPr>
+          <w:ilvl w:val="0"/>
+          <w:numId w:val="1004"/>
+        </w:numPr>
+      </w:pPr>
+      <w:r>
+        <w:t xml:space="preserve">Sammenlign med resten af klassen i</w:t>
+      </w:r>
+      <w:r>
+        <w:t xml:space="preserve"> </w:t>
+      </w:r>
+      <w:hyperlink w:anchor="tbl-2">
+        <w:r>
+          <w:rPr>
+            <w:rStyle w:val="Hyperlink"/>
+          </w:rPr>
+          <w:t xml:space="preserve">Tabel 2</w:t>
+        </w:r>
+      </w:hyperlink>
+      <w:r>
+        <w:t xml:space="preserve"> </w:t>
+      </w:r>
+      <w:r>
+        <w:t xml:space="preserve">— især de grupper, der brugte kiwi eller appelsin i stedet for kontrolglasset. Hvilke af frugterne ser ud til at indeholde et proteinnedbrydende enzym, og hvilke gør ikke? Er I enige på tværs af grupperne, eller er der glas, hvor resultaterne ikke stemmer overens?</w:t>
+      </w:r>
+    </w:p>
+    <w:tbl>
+      <w:tblPr>
+        <w:tblStyle w:val="Table"/>
+        <w:tblW w:type="pct" w:w="5000"/>
+        <w:tblLayout w:type="fixed"/>
+        <w:tblLook w:firstRow="0" w:lastRow="0" w:firstColumn="0" w:lastColumn="0" w:noHBand="0" w:noVBand="0" w:val="0000"/>
+      </w:tblPr>
+      <w:tblGrid>
+        <w:gridCol w:w="7920"/>
+      </w:tblGrid>
+      <w:tr>
+        <w:tc>
+          <w:tcPr/>
+          <w:bookmarkStart w:id="32" w:name="tbl-2"/>
+          <w:p>
+            <w:pPr>
+              <w:jc w:val="center"/>
+            </w:pPr>
+            <w:pPr>
+              <w:jc w:val="left"/>
+              <w:spacing w:before="200"/>
+              <w:pStyle w:val="ImageCaption"/>
+            </w:pPr>
+            <w:r>
+              <w:t xml:space="preserve">Tabel 2: Klassens resultater — stivnede gelatinen?</w:t>
+            </w:r>
+          </w:p>
+          <w:tbl>
+            <w:tblPr>
+              <w:tblStyle w:val="Table"/>
+              <w:tblW w:type="pct" w:w="5000"/>
+              <w:tblLayout w:type="fixed"/>
+              <w:tblLook w:firstRow="1" w:lastRow="0" w:firstColumn="0" w:lastColumn="0" w:noHBand="0" w:noVBand="0" w:val="0020"/>
+            </w:tblPr>
+            <w:tblGrid>
+              <w:gridCol w:w="1320"/>
+              <w:gridCol w:w="1650"/>
+              <w:gridCol w:w="1650"/>
+              <w:gridCol w:w="1650"/>
+              <w:gridCol w:w="1650"/>
+            </w:tblGrid>
+            <w:tr>
+              <w:trPr>
+                <w:cantSplit/>
+                <w:tblHeader w:val="on"/>
+              </w:trPr>
+              <w:tc>
+                <w:tcPr/>
+                <w:p>
+                  <w:pPr>
+                    <w:pStyle w:val="Compact"/>
+                    <w:keepNext/>
+                    <w:jc w:val="left"/>
+                    <w:jc w:val="center"/>
+                  </w:pPr>
+                  <w:r>
+                    <w:t xml:space="preserve">Gruppe</w:t>
+                  </w:r>
+                </w:p>
+              </w:tc>
+              <w:tc>
+                <w:tcPr/>
+                <w:p>
+                  <w:pPr>
+                    <w:pStyle w:val="Compact"/>
+                    <w:keepNext/>
+                    <w:jc w:val="center"/>
+                    <w:jc w:val="center"/>
+                  </w:pPr>
+                  <w:r>
+                    <w:t xml:space="preserve">1: Frisk ananas</w:t>
+                  </w:r>
+                </w:p>
+              </w:tc>
+              <w:tc>
+                <w:tcPr/>
+                <w:p>
+                  <w:pPr>
+                    <w:pStyle w:val="Compact"/>
+                    <w:keepNext/>
+                    <w:jc w:val="center"/>
+                    <w:jc w:val="center"/>
+                  </w:pPr>
+                  <w:r>
+                    <w:t xml:space="preserve">2: Kogt ananas</w:t>
+                  </w:r>
+                </w:p>
+              </w:tc>
+              <w:tc>
+                <w:tcPr/>
+                <w:p>
+                  <w:pPr>
+                    <w:pStyle w:val="Compact"/>
+                    <w:keepNext/>
+                    <w:jc w:val="center"/>
+                    <w:jc w:val="center"/>
+                  </w:pPr>
+                  <w:r>
+                    <w:t xml:space="preserve">3: Ananas + syre</w:t>
+                  </w:r>
+                </w:p>
+              </w:tc>
+              <w:tc>
+                <w:tcPr/>
+                <w:p>
+                  <w:pPr>
+                    <w:pStyle w:val="Compact"/>
+                    <w:keepNext/>
+                    <w:jc w:val="center"/>
+                    <w:jc w:val="center"/>
+                  </w:pPr>
+                  <w:r>
+                    <w:t xml:space="preserve">4: Kontrol eller anden frugt (hvilken?)</w:t>
+                  </w:r>
+                </w:p>
+              </w:tc>
+            </w:tr>
+            <w:tr>
+              <w:trPr>
+                <w:cantSplit/>
+              </w:trPr>
+              <w:tc>
+                <w:tcPr/>
+                <w:p>
+                  <w:pPr>
+                    <w:pStyle w:val="Compact"/>
+                    <w:keepNext/>
+                    <w:jc w:val="left"/>
+                    <w:jc w:val="center"/>
+                  </w:pPr>
+                  <w:r>
+                    <w:t xml:space="preserve">Vores</w:t>
+                  </w:r>
+                </w:p>
+              </w:tc>
+              <w:tc>
+                <w:tcPr/>
+                <w:p>
+                  <w:pPr>
+                    <w:pStyle w:val="Compact"/>
+                    <w:keepNext/>
+                  </w:pPr>
+                </w:p>
+              </w:tc>
+              <w:tc>
+                <w:tcPr/>
+                <w:p>
+                  <w:pPr>
+                    <w:pStyle w:val="Compact"/>
+                    <w:keepNext/>
+                  </w:pPr>
+                </w:p>
+              </w:tc>
+              <w:tc>
+                <w:tcPr/>
+                <w:p>
+                  <w:pPr>
+                    <w:pStyle w:val="Compact"/>
+                    <w:keepNext/>
+                  </w:pPr>
+                </w:p>
+              </w:tc>
+              <w:tc>
+                <w:tcPr/>
+                <w:p>
+                  <w:pPr>
+                    <w:pStyle w:val="Compact"/>
+                    <w:keepNext/>
+                  </w:pPr>
+                </w:p>
+              </w:tc>
+            </w:tr>
+            <w:tr>
+              <w:trPr>
+                <w:cantSplit/>
+              </w:trPr>
+              <w:tc>
+                <w:tcPr/>
+                <w:p>
+                  <w:pPr>
+                    <w:pStyle w:val="Compact"/>
+                    <w:keepNext/>
+                  </w:pPr>
+                </w:p>
+              </w:tc>
+              <w:tc>
+                <w:tcPr/>
+                <w:p>
+                  <w:pPr>
+                    <w:pStyle w:val="Compact"/>
+                    <w:keepNext/>
+                  </w:pPr>
+                </w:p>
+              </w:tc>
+              <w:tc>
+                <w:tcPr/>
+                <w:p>
+                  <w:pPr>
+                    <w:pStyle w:val="Compact"/>
+                    <w:keepNext/>
+                  </w:pPr>
+                </w:p>
+              </w:tc>
+              <w:tc>
+                <w:tcPr/>
+                <w:p>
+                  <w:pPr>
+                    <w:pStyle w:val="Compact"/>
+                    <w:keepNext/>
+                  </w:pPr>
+                </w:p>
+              </w:tc>
+              <w:tc>
+                <w:tcPr/>
+                <w:p>
+                  <w:pPr>
+                    <w:pStyle w:val="Compact"/>
+                    <w:keepNext/>
+                  </w:pPr>
+                </w:p>
+              </w:tc>
+            </w:tr>
+            <w:tr>
+              <w:trPr>
+                <w:cantSplit/>
+              </w:trPr>
+              <w:tc>
+                <w:tcPr/>
+                <w:p>
+                  <w:pPr>
+                    <w:pStyle w:val="Compact"/>
+                    <w:keepNext/>
+                  </w:pPr>
+                </w:p>
+              </w:tc>
+              <w:tc>
+                <w:tcPr/>
+                <w:p>
+                  <w:pPr>
+                    <w:pStyle w:val="Compact"/>
+                    <w:keepNext/>
+                  </w:pPr>
+                </w:p>
+              </w:tc>
+              <w:tc>
+                <w:tcPr/>
+                <w:p>
+                  <w:pPr>
+                    <w:pStyle w:val="Compact"/>
+                    <w:keepNext/>
+                  </w:pPr>
+                </w:p>
+              </w:tc>
+              <w:tc>
+                <w:tcPr/>
+                <w:p>
+                  <w:pPr>
+                    <w:pStyle w:val="Compact"/>
+                    <w:keepNext/>
+                  </w:pPr>
+                </w:p>
+              </w:tc>
+              <w:tc>
+                <w:tcPr/>
+                <w:p>
+                  <w:pPr>
+                    <w:pStyle w:val="Compact"/>
+                    <w:keepNext/>
+                  </w:pPr>
+                </w:p>
+              </w:tc>
+            </w:tr>
+            <w:tr>
+              <w:trPr>
+                <w:cantSplit/>
+              </w:trPr>
+              <w:tc>
+                <w:tcPr/>
+                <w:p>
+                  <w:pPr>
+                    <w:pStyle w:val="Compact"/>
+                    <w:keepNext/>
+                  </w:pPr>
+                </w:p>
+              </w:tc>
+              <w:tc>
+                <w:tcPr/>
+                <w:p>
+                  <w:pPr>
+                    <w:pStyle w:val="Compact"/>
+                    <w:keepNext/>
+                  </w:pPr>
+                </w:p>
+              </w:tc>
+              <w:tc>
+                <w:tcPr/>
+                <w:p>
+                  <w:pPr>
+                    <w:pStyle w:val="Compact"/>
+                    <w:keepNext/>
+                  </w:pPr>
+                </w:p>
+              </w:tc>
+              <w:tc>
+                <w:tcPr/>
+                <w:p>
+                  <w:pPr>
+                    <w:pStyle w:val="Compact"/>
+                    <w:keepNext/>
+                  </w:pPr>
+                </w:p>
+              </w:tc>
+              <w:tc>
+                <w:tcPr/>
+                <w:p>
+                  <w:pPr>
+                    <w:pStyle w:val="Compact"/>
+                    <w:keepNext/>
+                  </w:pPr>
+                </w:p>
+              </w:tc>
+            </w:tr>
+            <w:tr>
+              <w:trPr>
+                <w:cantSplit/>
+              </w:trPr>
+              <w:tc>
+                <w:tcPr/>
+                <w:p>
+                  <w:pPr>
+                    <w:pStyle w:val="Compact"/>
+                  </w:pPr>
+                </w:p>
+              </w:tc>
+              <w:tc>
+                <w:tcPr/>
+                <w:p>
+                  <w:pPr>
+                    <w:pStyle w:val="Compact"/>
+                  </w:pPr>
+                </w:p>
+              </w:tc>
+              <w:tc>
+                <w:tcPr/>
+                <w:p>
+                  <w:pPr>
+                    <w:pStyle w:val="Compact"/>
+                  </w:pPr>
+                </w:p>
+              </w:tc>
+              <w:tc>
+                <w:tcPr/>
+                <w:p>
+                  <w:pPr>
+                    <w:pStyle w:val="Compact"/>
+                  </w:pPr>
+                </w:p>
+              </w:tc>
+              <w:tc>
+                <w:tcPr/>
+                <w:p>
+                  <w:pPr>
+                    <w:pStyle w:val="Compact"/>
+                  </w:pPr>
+                </w:p>
+              </w:tc>
+            </w:tr>
+          </w:tbl>
+          <w:bookmarkEnd w:id="32"/>
+          <w:p/>
+        </w:tc>
+      </w:tr>
+    </w:tbl>
+    <w:p>
+      <w:pPr>
+        <w:pStyle w:val="Compact"/>
+        <w:numPr>
+          <w:ilvl w:val="0"/>
+          <w:numId w:val="1005"/>
+        </w:numPr>
+      </w:pPr>
+      <w:r>
+        <w:rPr>
+          <w:b/>
+          <w:bCs/>
+        </w:rPr>
+        <w:t xml:space="preserve">Perspektivering.</w:t>
+      </w:r>
+      <w:r>
+        <w:t xml:space="preserve"> </w:t>
+      </w:r>
+      <w:r>
+        <w:t xml:space="preserve">Kan man lave gelé med frisk ananas? Med ananas fra dåse? Begrund begge svar med jeres egne resultater. Bromelin sælges også som kødmørner — forklar ud fra øvelsen, hvorfor det virker, og hvorfor det ikke virker, hvis man drysser det på kødet efter stegningen.</w:t>
+      </w:r>
+    </w:p>
+    <w:p>
+      <w:pPr>
+        <w:pStyle w:val="Compact"/>
+        <w:numPr>
+          <w:ilvl w:val="0"/>
+          <w:numId w:val="1005"/>
+        </w:numPr>
+      </w:pPr>
+      <w:r>
+        <w:rPr>
+          <w:b/>
+          <w:bCs/>
+        </w:rPr>
+        <w:t xml:space="preserve">Fejlkilder og konklusion.</w:t>
+      </w:r>
+      <w:r>
+        <w:t xml:space="preserve"> </w:t>
+      </w:r>
+      <w:r>
+        <w:t xml:space="preserve">Gik noget galt undervejs — blandede pipetter, ulige mængder gelatine, glas der ikke nåede at køle nok — skal I skrive hvad, og vurdere, hvilken vej det trak resultatet. Saml derefter op: hvad viste forsøget om bromelin, og hvad viste det om, hvad temperatur og pH betyder for et enzym?</w:t>
+      </w:r>
+    </w:p>
+    <w:bookmarkEnd w:id="33"/>
     <w:sectPr>
       <w:headerReference r:id="rId7" w:type="default"/>
       <w:footerReference r:id="rId8" w:type="default"/>
@@ -1519,6 +2106,91 @@
       </w:rPr>
     </w:lvl>
   </w:abstractNum>
+  <w:abstractNum w:abstractNumId="99417">
+    <w:nsid w:val="00A99417"/>
+    <w:multiLevelType w:val="multilevel"/>
+    <w:lvl w:ilvl="0">
+      <w:start w:val="7"/>
+      <w:numFmt w:val="decimal"/>
+      <w:lvlText w:val="%1."/>
+      <w:lvlJc w:val="left"/>
+      <w:pPr>
+        <w:ind w:left="720" w:hanging="360"/>
+      </w:pPr>
+    </w:lvl>
+    <w:lvl w:ilvl="1">
+      <w:start w:val="7"/>
+      <w:numFmt w:val="decimal"/>
+      <w:lvlText w:val="%2."/>
+      <w:lvlJc w:val="left"/>
+      <w:pPr>
+        <w:ind w:left="1440" w:hanging="360"/>
+      </w:pPr>
+    </w:lvl>
+    <w:lvl w:ilvl="2">
+      <w:start w:val="7"/>
+      <w:numFmt w:val="decimal"/>
+      <w:lvlText w:val="%3."/>
+      <w:lvlJc w:val="left"/>
+      <w:pPr>
+        <w:ind w:left="2160" w:hanging="360"/>
+      </w:pPr>
+    </w:lvl>
+    <w:lvl w:ilvl="3">
+      <w:start w:val="7"/>
+      <w:numFmt w:val="decimal"/>
+      <w:lvlText w:val="%4."/>
+      <w:lvlJc w:val="left"/>
+      <w:pPr>
+        <w:ind w:left="2880" w:hanging="360"/>
+      </w:pPr>
+    </w:lvl>
+    <w:lvl w:ilvl="4">
+      <w:start w:val="7"/>
+      <w:numFmt w:val="decimal"/>
+      <w:lvlText w:val="%5."/>
+      <w:lvlJc w:val="left"/>
+      <w:pPr>
+        <w:ind w:left="3600" w:hanging="360"/>
+      </w:pPr>
+    </w:lvl>
+    <w:lvl w:ilvl="5">
+      <w:start w:val="7"/>
+      <w:numFmt w:val="decimal"/>
+      <w:lvlText w:val="%6."/>
+      <w:lvlJc w:val="left"/>
+      <w:pPr>
+        <w:ind w:left="4320" w:hanging="360"/>
+      </w:pPr>
+    </w:lvl>
+    <w:lvl w:ilvl="6">
+      <w:start w:val="7"/>
+      <w:numFmt w:val="decimal"/>
+      <w:lvlText w:val="%7."/>
+      <w:lvlJc w:val="left"/>
+      <w:pPr>
+        <w:ind w:left="5040" w:hanging="360"/>
+      </w:pPr>
+    </w:lvl>
+    <w:lvl w:ilvl="7">
+      <w:start w:val="7"/>
+      <w:numFmt w:val="decimal"/>
+      <w:lvlText w:val="%8."/>
+      <w:lvlJc w:val="left"/>
+      <w:pPr>
+        <w:ind w:left="5760" w:hanging="360"/>
+      </w:pPr>
+    </w:lvl>
+    <w:lvl w:ilvl="8">
+      <w:start w:val="7"/>
+      <w:numFmt w:val="decimal"/>
+      <w:lvlText w:val="%9."/>
+      <w:lvlJc w:val="left"/>
+      <w:pPr>
+        <w:ind w:left="6480" w:hanging="360"/>
+      </w:pPr>
+    </w:lvl>
+  </w:abstractNum>
   <w:num w:numId="1">
     <w:abstractNumId w:val="1"/>
     <w:lvlOverride w:ilvl="0">
@@ -1575,6 +2247,66 @@
   </w:num>
   <w:num w:numId="1003">
     <w:abstractNumId w:val="991"/>
+  </w:num>
+  <w:num w:numId="1004">
+    <w:abstractNumId w:val="99411"/>
+    <w:lvlOverride w:ilvl="0">
+      <w:startOverride w:val="1"/>
+    </w:lvlOverride>
+    <w:lvlOverride w:ilvl="1">
+      <w:startOverride w:val="1"/>
+    </w:lvlOverride>
+    <w:lvlOverride w:ilvl="2">
+      <w:startOverride w:val="1"/>
+    </w:lvlOverride>
+    <w:lvlOverride w:ilvl="3">
+      <w:startOverride w:val="1"/>
+    </w:lvlOverride>
+    <w:lvlOverride w:ilvl="4">
+      <w:startOverride w:val="1"/>
+    </w:lvlOverride>
+    <w:lvlOverride w:ilvl="5">
+      <w:startOverride w:val="1"/>
+    </w:lvlOverride>
+    <w:lvlOverride w:ilvl="6">
+      <w:startOverride w:val="1"/>
+    </w:lvlOverride>
+    <w:lvlOverride w:ilvl="7">
+      <w:startOverride w:val="1"/>
+    </w:lvlOverride>
+    <w:lvlOverride w:ilvl="8">
+      <w:startOverride w:val="1"/>
+    </w:lvlOverride>
+  </w:num>
+  <w:num w:numId="1005">
+    <w:abstractNumId w:val="99417"/>
+    <w:lvlOverride w:ilvl="0">
+      <w:startOverride w:val="7"/>
+    </w:lvlOverride>
+    <w:lvlOverride w:ilvl="1">
+      <w:startOverride w:val="7"/>
+    </w:lvlOverride>
+    <w:lvlOverride w:ilvl="2">
+      <w:startOverride w:val="7"/>
+    </w:lvlOverride>
+    <w:lvlOverride w:ilvl="3">
+      <w:startOverride w:val="7"/>
+    </w:lvlOverride>
+    <w:lvlOverride w:ilvl="4">
+      <w:startOverride w:val="7"/>
+    </w:lvlOverride>
+    <w:lvlOverride w:ilvl="5">
+      <w:startOverride w:val="7"/>
+    </w:lvlOverride>
+    <w:lvlOverride w:ilvl="6">
+      <w:startOverride w:val="7"/>
+    </w:lvlOverride>
+    <w:lvlOverride w:ilvl="7">
+      <w:startOverride w:val="7"/>
+    </w:lvlOverride>
+    <w:lvlOverride w:ilvl="8">
+      <w:startOverride w:val="7"/>
+    </w:lvlOverride>
   </w:num>
 </w:numbering>
 </file>

</xml_diff>